<commit_message>
docs: final review completed
</commit_message>
<xml_diff>
--- a/9월_3주/캡스톤_컨펌발표_대본.docx
+++ b/9월_3주/캡스톤_컨펌발표_대본.docx
@@ -489,7 +489,7 @@
           <w:sz w:val="22"/>
           <w:szCs w:val="22"/>
         </w:rPr>
-        <w:t xml:space="preserve">5쪽</w:t>
+        <w:t xml:space="preserve">4쪽</w:t>
       </w:r>
       <w:r>
         <w:rPr>
@@ -711,7 +711,7 @@
           <w:sz w:val="18"/>
           <w:szCs w:val="18"/>
         </w:rPr>
-        <w:t xml:space="preserve">문서 3~11쪽. 기능표 5쪽, 화면 7~8쪽, 구조 9쪽, 기술 과제 10쪽, 예상 질문 11쪽</w:t>
+        <w:t xml:space="preserve">문서 3~11쪽. 기능표 4~5쪽, 화면 7~8쪽, 구조 9쪽, 기술 과제 10쪽, 예상 질문 11쪽</w:t>
       </w:r>
     </w:p>
     <w:p>
@@ -1542,7 +1542,7 @@
           <w:sz w:val="18"/>
           <w:szCs w:val="18"/>
         </w:rPr>
-        <w:t xml:space="preserve">문서 20~27쪽. 비교표 21쪽, 기능표 22쪽, 상태 전이 23쪽, 화면 24쪽, 기술 과제 26쪽, 예상 질문 27쪽</w:t>
+        <w:t xml:space="preserve">문서 20~27쪽. 비교표 21쪽, 기능표 21~22쪽, 상태 전이 23쪽, 화면 24쪽, 기술 과제 26쪽, 예상 질문 27쪽</w:t>
       </w:r>
     </w:p>
     <w:p>

</xml_diff>